<commit_message>
build(scorm): publicar C-1-1 V4, C-2-1 V2 y sincronizar C-3-3 V8
</commit_message>
<xml_diff>
--- a/docs/word_actualizadas/Guia_del_estudiante_C-1-1.docx
+++ b/docs/word_actualizadas/Guia_del_estudiante_C-1-1.docx
@@ -4,21 +4,30 @@
   <w:body>
     <w:p>
       <w:pPr>
-        <w:pStyle w:val="Title"/>
         <w:spacing w:after="80"/>
+        <w:jc w:val="center"/>
       </w:pPr>
       <w:r>
-        <w:t>Guía del estudiante C 1 1</w:t>
+        <w:rPr>
+          <w:rFonts w:ascii="Arial" w:hAnsi="Arial"/>
+          <w:b/>
+          <w:color w:val="004B87"/>
+          <w:sz w:val="44"/>
+        </w:rPr>
+        <w:t>Guía del estudiante C-1-1</w:t>
       </w:r>
     </w:p>
     <w:p>
       <w:pPr>
         <w:spacing w:after="280"/>
+        <w:jc w:val="center"/>
       </w:pPr>
       <w:r>
         <w:rPr>
+          <w:rFonts w:ascii="Arial" w:hAnsi="Arial"/>
           <w:b/>
-          <w:sz w:val="24"/>
+          <w:color w:val="59697D"/>
+          <w:sz w:val="26"/>
         </w:rPr>
         <w:t>Señales fundamentales de tiempo discreto</w:t>
       </w:r>
@@ -28,7 +37,7 @@
         <w:pStyle w:val="Heading1"/>
       </w:pPr>
       <w:r>
-        <w:t>1 Información general</w:t>
+        <w:t>1. Información general</w:t>
       </w:r>
     </w:p>
     <w:p>
@@ -51,8 +60,8 @@
         </w:tblBorders>
       </w:tblPr>
       <w:tblGrid>
-        <w:gridCol w:w="4968"/>
-        <w:gridCol w:w="4968"/>
+        <w:gridCol w:w="4819"/>
+        <w:gridCol w:w="4819"/>
       </w:tblGrid>
       <w:tr>
         <w:trPr>
@@ -370,15 +379,20 @@
     </w:tbl>
     <w:p>
       <w:pPr>
-        <w:spacing w:after="0"/>
+        <w:spacing w:before="0" w:after="0" w:line="40" w:lineRule="exact"/>
       </w:pPr>
+      <w:r>
+        <w:rPr>
+          <w:sz w:val="4"/>
+        </w:rPr>
+      </w:r>
     </w:p>
     <w:p>
       <w:pPr>
         <w:pStyle w:val="Heading1"/>
       </w:pPr>
       <w:r>
-        <w:t>2 Resultado de aprendizaje</w:t>
+        <w:t>2. Resultado de aprendizaje</w:t>
       </w:r>
     </w:p>
     <w:p>
@@ -391,7 +405,7 @@
         <w:pStyle w:val="Heading1"/>
       </w:pPr>
       <w:r>
-        <w:t>3 Antes de comenzar</w:t>
+        <w:t>3. Antes de comenzar</w:t>
       </w:r>
     </w:p>
     <w:p>
@@ -423,6 +437,14 @@
         <w:pStyle w:val="ListBullet"/>
       </w:pPr>
       <w:r>
+        <w:t>Utiliza punto (.) como separador decimal. Ejemplo: 1.5.</w:t>
+      </w:r>
+    </w:p>
+    <w:p>
+      <w:pPr>
+        <w:pStyle w:val="ListBullet"/>
+      </w:pPr>
+      <w:r>
         <w:t>Separa las muestras de una secuencia con comas.</w:t>
       </w:r>
     </w:p>
@@ -439,7 +461,7 @@
         <w:pStyle w:val="Heading1"/>
       </w:pPr>
       <w:r>
-        <w:t>4 Fundamentos</w:t>
+        <w:t>4. Fundamentos</w:t>
       </w:r>
     </w:p>
     <w:tbl>
@@ -457,9 +479,9 @@
         </w:tblBorders>
       </w:tblPr>
       <w:tblGrid>
-        <w:gridCol w:w="3312"/>
-        <w:gridCol w:w="3312"/>
-        <w:gridCol w:w="3312"/>
+        <w:gridCol w:w="3213"/>
+        <w:gridCol w:w="3213"/>
+        <w:gridCol w:w="3213"/>
       </w:tblGrid>
       <w:tr>
         <w:trPr>
@@ -926,15 +948,20 @@
     </w:tbl>
     <w:p>
       <w:pPr>
-        <w:spacing w:after="0"/>
+        <w:spacing w:before="0" w:after="0" w:line="40" w:lineRule="exact"/>
       </w:pPr>
+      <w:r>
+        <w:rPr>
+          <w:sz w:val="4"/>
+        </w:rPr>
+      </w:r>
     </w:p>
     <w:p>
       <w:pPr>
         <w:pStyle w:val="Heading1"/>
       </w:pPr>
       <w:r>
-        <w:t>5 Ruta de la actividad</w:t>
+        <w:t>5. Ruta de la actividad</w:t>
       </w:r>
     </w:p>
     <w:tbl>
@@ -952,9 +979,9 @@
         </w:tblBorders>
       </w:tblPr>
       <w:tblGrid>
-        <w:gridCol w:w="3312"/>
-        <w:gridCol w:w="3312"/>
-        <w:gridCol w:w="3312"/>
+        <w:gridCol w:w="3213"/>
+        <w:gridCol w:w="3213"/>
+        <w:gridCol w:w="3213"/>
       </w:tblGrid>
       <w:tr>
         <w:trPr>
@@ -1421,15 +1448,20 @@
     </w:tbl>
     <w:p>
       <w:pPr>
-        <w:spacing w:after="0"/>
+        <w:spacing w:before="0" w:after="0" w:line="40" w:lineRule="exact"/>
       </w:pPr>
+      <w:r>
+        <w:rPr>
+          <w:sz w:val="4"/>
+        </w:rPr>
+      </w:r>
     </w:p>
     <w:p>
       <w:pPr>
         <w:pStyle w:val="Heading1"/>
       </w:pPr>
       <w:r>
-        <w:t>6 Formulación de referencia</w:t>
+        <w:t>6. Formulación de referencia</w:t>
       </w:r>
     </w:p>
     <w:p>
@@ -1444,7 +1476,7 @@
     </w:p>
     <w:p>
       <w:r>
-        <w:t>Paso 3: para x[n] = (1/2)ⁿu[n], x[0] = 1 y x[2] = 0,25; la señal disminuye hacia cero.</w:t>
+        <w:t>Paso 3: para x[n] = (1/2)ⁿu[n], x[0] = 1 y x[2] = 0.25; la señal disminuye hacia cero.</w:t>
       </w:r>
     </w:p>
     <w:p>
@@ -1457,7 +1489,7 @@
         <w:pStyle w:val="Heading1"/>
       </w:pPr>
       <w:r>
-        <w:t>7 Evaluación</w:t>
+        <w:t>7. Evaluación</w:t>
       </w:r>
     </w:p>
     <w:tbl>
@@ -1475,9 +1507,9 @@
         </w:tblBorders>
       </w:tblPr>
       <w:tblGrid>
-        <w:gridCol w:w="3312"/>
-        <w:gridCol w:w="3312"/>
-        <w:gridCol w:w="3312"/>
+        <w:gridCol w:w="3213"/>
+        <w:gridCol w:w="3213"/>
+        <w:gridCol w:w="3213"/>
       </w:tblGrid>
       <w:tr>
         <w:trPr>
@@ -1870,8 +1902,13 @@
     </w:tbl>
     <w:p>
       <w:pPr>
-        <w:spacing w:after="0"/>
+        <w:spacing w:before="0" w:after="0" w:line="40" w:lineRule="exact"/>
       </w:pPr>
+      <w:r>
+        <w:rPr>
+          <w:sz w:val="4"/>
+        </w:rPr>
+      </w:r>
     </w:p>
     <w:p>
       <w:r>
@@ -1883,7 +1920,7 @@
         <w:pStyle w:val="Heading1"/>
       </w:pPr>
       <w:r>
-        <w:t>8 Lista de verificación</w:t>
+        <w:t>8. Lista de verificación</w:t>
       </w:r>
     </w:p>
     <w:p>
@@ -1927,13 +1964,80 @@
       </w:r>
     </w:p>
     <w:sectPr>
-      <w:pgSz w:w="12240" w:h="15840"/>
-      <w:pgMar w:top="893" w:right="1152" w:bottom="893" w:left="1152" w:header="720" w:footer="720" w:gutter="0"/>
+      <w:headerReference w:type="even" r:id="rId9"/>
+      <w:headerReference w:type="default" r:id="rId9"/>
+      <w:footerReference w:type="default" r:id="rId10"/>
+      <w:pgSz w:w="11906" w:h="16838"/>
+      <w:pgMar w:top="1644" w:right="1134" w:bottom="1020" w:left="1134" w:header="227" w:footer="397" w:gutter="0"/>
       <w:cols w:space="720"/>
       <w:docGrid w:linePitch="360"/>
     </w:sectPr>
   </w:body>
 </w:document>
+</file>
+
+<file path=word/footer1.xml><?xml version="1.0" encoding="utf-8"?>
+<w:ftr xmlns:m="http://schemas.openxmlformats.org/officeDocument/2006/math" xmlns:mc="http://schemas.openxmlformats.org/markup-compatibility/2006" xmlns:mo="http://schemas.microsoft.com/office/mac/office/2008/main" xmlns:mv="urn:schemas-microsoft-com:mac:vml" xmlns:o="urn:schemas-microsoft-com:office:office" xmlns:r="http://schemas.openxmlformats.org/officeDocument/2006/relationships" xmlns:v="urn:schemas-microsoft-com:vml" xmlns:w10="urn:schemas-microsoft-com:office:word" xmlns:w14="http://schemas.microsoft.com/office/word/2010/wordml" xmlns:w="http://schemas.openxmlformats.org/wordprocessingml/2006/main" xmlns:wne="http://schemas.microsoft.com/office/word/2006/wordml" xmlns:wp14="http://schemas.microsoft.com/office/word/2010/wordprocessingDrawing" xmlns:wp="http://schemas.openxmlformats.org/drawingml/2006/wordprocessingDrawing" xmlns:wpc="http://schemas.microsoft.com/office/word/2010/wordprocessingCanvas" xmlns:wpg="http://schemas.microsoft.com/office/word/2010/wordprocessingGroup" xmlns:wpi="http://schemas.microsoft.com/office/word/2010/wordprocessingInk" xmlns:wps="http://schemas.microsoft.com/office/word/2010/wordprocessingShape" mc:Ignorable="w14 wp14">
+  <w:p>
+    <w:pPr>
+      <w:pStyle w:val="Footer"/>
+      <w:jc w:val="center"/>
+    </w:pPr>
+    <w:r>
+      <w:rPr>
+        <w:rFonts w:ascii="Arial" w:hAnsi="Arial"/>
+        <w:color w:val="59697D"/>
+        <w:sz w:val="18"/>
+      </w:rPr>
+      <w:t>Guía del estudiante C-1-1</w:t>
+    </w:r>
+  </w:p>
+</w:ftr>
+</file>
+
+<file path=word/header1.xml><?xml version="1.0" encoding="utf-8"?>
+<w:hdr xmlns:m="http://schemas.openxmlformats.org/officeDocument/2006/math" xmlns:mc="http://schemas.openxmlformats.org/markup-compatibility/2006" xmlns:mo="http://schemas.microsoft.com/office/mac/office/2008/main" xmlns:mv="urn:schemas-microsoft-com:mac:vml" xmlns:o="urn:schemas-microsoft-com:office:office" xmlns:r="http://schemas.openxmlformats.org/officeDocument/2006/relationships" xmlns:v="urn:schemas-microsoft-com:vml" xmlns:w10="urn:schemas-microsoft-com:office:word" xmlns:w14="http://schemas.microsoft.com/office/word/2010/wordml" xmlns:w="http://schemas.openxmlformats.org/wordprocessingml/2006/main" xmlns:wne="http://schemas.microsoft.com/office/word/2006/wordml" xmlns:wp14="http://schemas.microsoft.com/office/word/2010/wordprocessingDrawing" xmlns:wp="http://schemas.openxmlformats.org/drawingml/2006/wordprocessingDrawing" xmlns:wpc="http://schemas.microsoft.com/office/word/2010/wordprocessingCanvas" xmlns:wpg="http://schemas.microsoft.com/office/word/2010/wordprocessingGroup" xmlns:wpi="http://schemas.microsoft.com/office/word/2010/wordprocessingInk" xmlns:wps="http://schemas.microsoft.com/office/word/2010/wordprocessingShape" mc:Ignorable="w14 wp14">
+  <w:p>
+    <w:pPr>
+      <w:pStyle w:val="Header"/>
+      <w:jc w:val="center"/>
+    </w:pPr>
+    <w:r>
+      <w:drawing>
+        <wp:inline xmlns:a="http://schemas.openxmlformats.org/drawingml/2006/main" xmlns:pic="http://schemas.openxmlformats.org/drawingml/2006/picture">
+          <wp:extent cx="6120000" cy="1124795"/>
+          <wp:docPr id="1" name="Picture 1"/>
+          <wp:cNvGraphicFramePr>
+            <a:graphicFrameLocks noChangeAspect="1"/>
+          </wp:cNvGraphicFramePr>
+          <a:graphic>
+            <a:graphicData uri="http://schemas.openxmlformats.org/drawingml/2006/picture">
+              <pic:pic>
+                <pic:nvPicPr>
+                  <pic:cNvPr id="0" name="encabezado_institucional.png"/>
+                  <pic:cNvPicPr/>
+                </pic:nvPicPr>
+                <pic:blipFill>
+                  <a:blip r:embed="rId1"/>
+                  <a:stretch>
+                    <a:fillRect/>
+                  </a:stretch>
+                </pic:blipFill>
+                <pic:spPr>
+                  <a:xfrm>
+                    <a:off x="0" y="0"/>
+                    <a:ext cx="6120000" cy="1124795"/>
+                  </a:xfrm>
+                  <a:prstGeom prst="rect"/>
+                </pic:spPr>
+              </pic:pic>
+            </a:graphicData>
+          </a:graphic>
+        </wp:inline>
+      </w:drawing>
+    </w:r>
+  </w:p>
+</w:hdr>
 </file>
 
 <file path=word/numbering.xml><?xml version="1.0" encoding="utf-8"?>
@@ -2304,6 +2408,7 @@
     </w:pPr>
     <w:rPr>
       <w:rFonts w:ascii="Arial" w:hAnsi="Arial"/>
+      <w:color w:val="13263F"/>
       <w:sz w:val="20"/>
     </w:rPr>
   </w:style>
@@ -2369,7 +2474,7 @@
       <w:rFonts w:asciiTheme="majorHAnsi" w:eastAsiaTheme="majorEastAsia" w:hAnsiTheme="majorHAnsi" w:cstheme="majorBidi" w:ascii="Arial" w:hAnsi="Arial"/>
       <w:b/>
       <w:bCs/>
-      <w:color w:val="000000"/>
+      <w:color w:val="004B87"/>
       <w:sz w:val="30"/>
       <w:szCs w:val="28"/>
     </w:rPr>
@@ -2386,14 +2491,14 @@
     <w:pPr>
       <w:keepNext/>
       <w:keepLines/>
-      <w:spacing w:before="180" w:after="80"/>
+      <w:spacing w:before="200" w:after="100"/>
       <w:outlineLvl w:val="1"/>
     </w:pPr>
     <w:rPr>
       <w:rFonts w:asciiTheme="majorHAnsi" w:eastAsiaTheme="majorEastAsia" w:hAnsiTheme="majorHAnsi" w:cstheme="majorBidi" w:ascii="Arial" w:hAnsi="Arial"/>
       <w:b/>
       <w:bCs/>
-      <w:color w:val="000000"/>
+      <w:color w:val="004B87"/>
       <w:sz w:val="24"/>
       <w:szCs w:val="26"/>
     </w:rPr>
@@ -2410,14 +2515,15 @@
     <w:pPr>
       <w:keepNext/>
       <w:keepLines/>
-      <w:spacing w:before="200" w:after="0"/>
+      <w:spacing w:before="160" w:after="80"/>
       <w:outlineLvl w:val="2"/>
     </w:pPr>
     <w:rPr>
-      <w:rFonts w:asciiTheme="majorHAnsi" w:eastAsiaTheme="majorEastAsia" w:hAnsiTheme="majorHAnsi" w:cstheme="majorBidi"/>
+      <w:rFonts w:asciiTheme="majorHAnsi" w:eastAsiaTheme="majorEastAsia" w:hAnsiTheme="majorHAnsi" w:cstheme="majorBidi" w:ascii="Arial" w:hAnsi="Arial"/>
       <w:b/>
       <w:bCs/>
-      <w:color w:val="4F81BD" w:themeColor="accent1"/>
+      <w:color w:val="004B87"/>
+      <w:sz w:val="22"/>
     </w:rPr>
   </w:style>
   <w:style w:type="paragraph" w:styleId="Heading4">
@@ -2648,16 +2754,18 @@
     <w:qFormat/>
     <w:rsid w:val="00FC693F"/>
     <w:pPr>
+      <w:pBdr>
+        <w:bottom w:val="single" w:sz="8" w:space="4" w:color="4F81BD" w:themeColor="accent1"/>
+      </w:pBdr>
       <w:spacing w:after="300" w:line="240" w:lineRule="auto"/>
       <w:contextualSpacing/>
     </w:pPr>
     <w:rPr>
-      <w:rFonts w:asciiTheme="majorHAnsi" w:eastAsiaTheme="majorEastAsia" w:hAnsiTheme="majorHAnsi" w:cstheme="majorBidi" w:ascii="Arial" w:hAnsi="Arial"/>
-      <w:b/>
-      <w:color w:val="000000"/>
+      <w:rFonts w:asciiTheme="majorHAnsi" w:eastAsiaTheme="majorEastAsia" w:hAnsiTheme="majorHAnsi" w:cstheme="majorBidi"/>
+      <w:color w:val="17365D" w:themeColor="text2" w:themeShade="BF"/>
       <w:spacing w:val="5"/>
       <w:kern w:val="28"/>
-      <w:sz w:val="48"/>
+      <w:sz w:val="52"/>
       <w:szCs w:val="52"/>
     </w:rPr>
   </w:style>

</xml_diff>